<commit_message>
Add PDF version, fix table fonts
Co-Authored-By: Claude Sonnet 5.5 <noreply@anthropic.com>
Claude-Session: https://claude.ai/code/session_015ZvLWGhGjxqgnQ3ctwLV8B
</commit_message>
<xml_diff>
--- a/out/Практическое_задание_тема1.docx
+++ b/out/Практическое_задание_тема1.docx
@@ -276,6 +276,9 @@
               <w:t>1) — ВВП:</w:t>
             </w:r>
             <w:r>
+              <w:rPr>
+                <w:rFonts w:ascii="Times New Roman" w:hAnsi="Times New Roman"/>
+              </w:rPr>
               <w:t xml:space="preserve"> Рост замедляется после «разгона»: 2023 г. ≈ +3,6–4,1 %, 2024 г. ≈ +4,3 %, 2025 г. ≈ +1 % (охлаждение из-за высокой ключевой ставки, до 21 % в конце 2024 г.). Драйверы — оборонный и госзаказ, импортозамещение, внутренний спрос.</w:t>
             </w:r>
           </w:p>
@@ -295,6 +298,9 @@
               <w:t>2) занятость:</w:t>
             </w:r>
             <w:r>
+              <w:rPr>
+                <w:rFonts w:ascii="Times New Roman" w:hAnsi="Times New Roman"/>
+              </w:rPr>
               <w:t xml:space="preserve"> Безработица упала до исторического минимума (≈ 2,9 % в 2024 г., ≈ 2,2–2,5 % в 2025 г.). Факторы: дефицит кадров из-за демографии и оттока/мобилизации, рост занятости в ОПК и госсекторе, высокий спрос на рабочую силу, внутренний туризм и импортозамещение. Следствие — рост зарплат, но дефицит кадров сдерживает рост экономики.</w:t>
             </w:r>
           </w:p>
@@ -314,6 +320,9 @@
               <w:t>3) инфляция:</w:t>
             </w:r>
             <w:r>
+              <w:rPr>
+                <w:rFonts w:ascii="Times New Roman" w:hAnsi="Times New Roman"/>
+              </w:rPr>
               <w:t xml:space="preserve"> Инфляция ускорилась: ≈ 7,4 % (2023) → ≈ 9,5 % (2024), затем снижение до ≈ 5–6 % в 2025 г. под действием жёсткой денежно-кредитной политики Банка России.</w:t>
             </w:r>
           </w:p>
@@ -333,6 +342,9 @@
               <w:t>4) доходы:</w:t>
             </w:r>
             <w:r>
+              <w:rPr>
+                <w:rFonts w:ascii="Times New Roman" w:hAnsi="Times New Roman"/>
+              </w:rPr>
               <w:t xml:space="preserve"> Реальные доходы населения росли (2023 ≈ +5 %, 2024 ≈ +7 %, реальные зарплаты ≈ +9 %), в 2025 г. рост замедлился до ≈ +2–4 %. Соцполитика: индексация пенсий и МРОТ, семейная ипотека, материнский капитал, единое пособие для семей с детьми, налоговая реформа с прогрессивной шкалой НДФЛ (с 2025 г.), поддержка семей участников СВО, демографические меры — акцент на сохранении доходов и повышении рождаемости.</w:t>
             </w:r>
           </w:p>
@@ -506,6 +518,9 @@
               <w:t>1) Москва</w:t>
             </w:r>
             <w:r>
+              <w:rPr>
+                <w:rFonts w:ascii="Times New Roman" w:hAnsi="Times New Roman"/>
+              </w:rPr>
               <w:t xml:space="preserve"> — финансово-деловой центр страны, столица; специализация: финансы, госуправление, ИТ, торговля, услуги, наука. Даёт значительную долю налоговых поступлений, бюджет профицитный.</w:t>
             </w:r>
           </w:p>
@@ -525,6 +540,9 @@
               <w:t>2) Тюменская область</w:t>
             </w:r>
             <w:r>
+              <w:rPr>
+                <w:rFonts w:ascii="Times New Roman" w:hAnsi="Times New Roman"/>
+              </w:rPr>
               <w:t xml:space="preserve"> — нефтегазовый регион (ХМАО и ЯНАО в составе Тюменской области с автономными округами: добыча нефти и газа). Специализация определяется ресурсами; регион — донор федерального бюджета.</w:t>
             </w:r>
           </w:p>
@@ -544,6 +562,9 @@
               <w:t>3) Татарстан</w:t>
             </w:r>
             <w:r>
+              <w:rPr>
+                <w:rFonts w:ascii="Times New Roman" w:hAnsi="Times New Roman"/>
+              </w:rPr>
               <w:t xml:space="preserve"> — нефтехимия, нефтедобыча, машиностроение (КАМАЗ), авиа- и вертолётостроение, ИТ-кластер (Иннополис), особая экономическая зона «Алабуга»; диверсифицированная экономика.</w:t>
             </w:r>
           </w:p>
@@ -563,6 +584,9 @@
               <w:t>4) Краснодарский край</w:t>
             </w:r>
             <w:r>
+              <w:rPr>
+                <w:rFonts w:ascii="Times New Roman" w:hAnsi="Times New Roman"/>
+              </w:rPr>
               <w:t xml:space="preserve"> — АПК (зерно, масло, овощи, виноград), морские порты Новороссийск и Туапсе, курортно-рекреационный комплекс (Сочи), транспорт и логистика.</w:t>
             </w:r>
           </w:p>
@@ -582,6 +606,9 @@
               <w:t>5) Кемеровская область</w:t>
             </w:r>
             <w:r>
+              <w:rPr>
+                <w:rFonts w:ascii="Times New Roman" w:hAnsi="Times New Roman"/>
+              </w:rPr>
               <w:t xml:space="preserve"> — «угольная столица» России (Кузбасс), добыча угля, металлургия, химия; зависимость от мировых цен и экспортных логистических ограничений.</w:t>
             </w:r>
           </w:p>
@@ -601,6 +628,9 @@
               <w:t>6) Дагестан</w:t>
             </w:r>
             <w:r>
+              <w:rPr>
+                <w:rFonts w:ascii="Times New Roman" w:hAnsi="Times New Roman"/>
+              </w:rPr>
               <w:t xml:space="preserve"> — аграрно-рекреационный регион, высокая доля госсектора и трансфертов, молодое население, рыболовство, виноградарство; дотационный регион.</w:t>
             </w:r>
           </w:p>
@@ -620,6 +650,9 @@
               <w:t>7) Мурманская область</w:t>
             </w:r>
             <w:r>
+              <w:rPr>
+                <w:rFonts w:ascii="Times New Roman" w:hAnsi="Times New Roman"/>
+              </w:rPr>
               <w:t xml:space="preserve"> — рыбная промышленность, морской порт (незамерзающий), Северный флот, добыча полезных ископаемых (Кольский полуостров), Арктика; стратегическое значение.</w:t>
             </w:r>
           </w:p>
@@ -979,6 +1012,9 @@
               </w:rPr>
             </w:pPr>
             <w:r>
+              <w:rPr>
+                <w:rFonts w:ascii="Times New Roman" w:hAnsi="Times New Roman"/>
+              </w:rPr>
               <w:t>1) Александр Невский; 2) Пётр I; 3) Екатерина II; 4) Пётр Столыпин (для современности — В. В. Путин).</w:t>
             </w:r>
           </w:p>
@@ -1040,6 +1076,9 @@
               </w:rPr>
             </w:pPr>
             <w:r>
+              <w:rPr>
+                <w:rFonts w:ascii="Times New Roman" w:hAnsi="Times New Roman"/>
+              </w:rPr>
               <w:t>1) М. В. Ломоносов; 2) Д. И. Менделеев; 3) С. П. Королёв; 4) И. В. Курчатов.</w:t>
             </w:r>
           </w:p>
@@ -1101,6 +1140,9 @@
               </w:rPr>
             </w:pPr>
             <w:r>
+              <w:rPr>
+                <w:rFonts w:ascii="Times New Roman" w:hAnsi="Times New Roman"/>
+              </w:rPr>
               <w:t>1) А. С. Пушкин; 2) Ф. М. Достоевский; 3) П. И. Чайковский; 4) Д. Д. Шостакович.</w:t>
             </w:r>
           </w:p>
@@ -1162,6 +1204,9 @@
               </w:rPr>
             </w:pPr>
             <w:r>
+              <w:rPr>
+                <w:rFonts w:ascii="Times New Roman" w:hAnsi="Times New Roman"/>
+              </w:rPr>
               <w:t>1) Илья Муромец / Евпатий Коловрат; 2) Козьма Минин и Дмитрий Пожарский; 3) Александр Матросов; 4) Зоя Космодемьянская (ВОВ).</w:t>
             </w:r>
           </w:p>
@@ -1451,6 +1496,9 @@
               </w:rPr>
             </w:pPr>
             <w:r>
+              <w:rPr>
+                <w:rFonts w:ascii="Times New Roman" w:hAnsi="Times New Roman"/>
+              </w:rPr>
               <w:t>Смута начала XVII в.; Нашествие Батыя и борьба за независимость (XIII в.); Северная война; Отечественная война 1812 г.; Гражданская война; Великая Отечественная война 1941–1945 гг.; распад СССР и 1990-е; современные санкционные вызовы.</w:t>
             </w:r>
           </w:p>
@@ -1491,6 +1539,9 @@
               </w:rPr>
             </w:pPr>
             <w:r>
+              <w:rPr>
+                <w:rFonts w:ascii="Times New Roman" w:hAnsi="Times New Roman"/>
+              </w:rPr>
               <w:t>Внешняя военная агрессия (монголы, шведы, поляки, Наполеон, Германия); внутренние кризисы и расколы; экономическая блокада и санкции; угроза утраты государственности и суверенитета.</w:t>
             </w:r>
           </w:p>
@@ -1531,6 +1582,9 @@
               </w:rPr>
             </w:pPr>
             <w:r>
+              <w:rPr>
+                <w:rFonts w:ascii="Times New Roman" w:hAnsi="Times New Roman"/>
+              </w:rPr>
               <w:t>Битва на Калке и Ледовое побоище; освобождение Москвы ополчением Минина и Пожарского (1612); Полтавская битва (1709); Бородино и изгнание Наполеона (1812); Сталинградская и Курская битвы, Берлин (1945); полёт Гагарина (1961).</w:t>
             </w:r>
           </w:p>
@@ -1585,6 +1639,9 @@
               </w:rPr>
             </w:pPr>
             <w:r>
+              <w:rPr>
+                <w:rFonts w:ascii="Times New Roman" w:hAnsi="Times New Roman"/>
+              </w:rPr>
               <w:t>Сохранение государства и независимости, единство многонационального народа, победа над нацизмом, укрепление роли России как страны-цивилизации, развитие науки, культуры и промышленности после испытаний.</w:t>
             </w:r>
           </w:p>
@@ -1632,6 +1689,9 @@
               </w:rPr>
             </w:pPr>
             <w:r>
+              <w:rPr>
+                <w:rFonts w:ascii="Times New Roman" w:hAnsi="Times New Roman"/>
+              </w:rPr>
               <w:t>Память о героях: 9 Мая и «Бессмертный полк», День народного единства (4 ноября), памятники и музеи, названия улиц, семейная память о ветеранах, ценности взаимопомощи, патриотизма, единства и служения Отечеству.</w:t>
             </w:r>
           </w:p>

</xml_diff>